<commit_message>
feat: renovacion de documentos
</commit_message>
<xml_diff>
--- a/static/docs/DocumentosPostulacion/Formulario inscripción de candidaturas Directiva Regional.docx
+++ b/static/docs/DocumentosPostulacion/Formulario inscripción de candidaturas Directiva Regional.docx
@@ -130,6 +130,20 @@
         </w:rPr>
         <w:t>candidaturas</w:t>
       </w:r>
+      <w:r>
+        <w:rPr>
+          <w:rFonts w:ascii="Calibri" w:eastAsia="Times New Roman" w:hAnsi="Calibri" w:cs="Times New Roman"/>
+          <w:b/>
+          <w:spacing w:val="-2"/>
+          <w:kern w:val="0"/>
+          <w:sz w:val="22"/>
+          <w:szCs w:val="22"/>
+          <w:u w:val="single"/>
+          <w:lang w:val="es-ES"/>
+          <w14:ligatures w14:val="none"/>
+        </w:rPr>
+        <w:t xml:space="preserve"> directiva regional</w:t>
+      </w:r>
     </w:p>
     <w:p>
       <w:pPr>
@@ -160,341 +174,7 @@
           <w:lang w:val="es-ES"/>
           <w14:ligatures w14:val="none"/>
         </w:rPr>
-        <w:t>Elecciones</w:t>
-      </w:r>
-      <w:r>
-        <w:rPr>
-          <w:rFonts w:ascii="Calibri" w:eastAsia="Times New Roman" w:hAnsi="Calibri" w:cs="Times New Roman"/>
-          <w:b/>
-          <w:spacing w:val="-7"/>
-          <w:kern w:val="0"/>
-          <w:sz w:val="22"/>
-          <w:szCs w:val="22"/>
-          <w:u w:val="single"/>
-          <w:lang w:val="es-ES"/>
-          <w14:ligatures w14:val="none"/>
-        </w:rPr>
-        <w:t xml:space="preserve"> </w:t>
-      </w:r>
-      <w:r>
-        <w:rPr>
-          <w:rFonts w:ascii="Calibri" w:eastAsia="Times New Roman" w:hAnsi="Calibri" w:cs="Times New Roman"/>
-          <w:b/>
-          <w:kern w:val="0"/>
-          <w:sz w:val="22"/>
-          <w:szCs w:val="22"/>
-          <w:u w:val="single"/>
-          <w:lang w:val="es-ES"/>
-          <w14:ligatures w14:val="none"/>
-        </w:rPr>
-        <w:t>(nacional,</w:t>
-      </w:r>
-      <w:r>
-        <w:rPr>
-          <w:rFonts w:ascii="Calibri" w:eastAsia="Times New Roman" w:hAnsi="Calibri" w:cs="Times New Roman"/>
-          <w:b/>
-          <w:spacing w:val="-3"/>
-          <w:kern w:val="0"/>
-          <w:sz w:val="22"/>
-          <w:szCs w:val="22"/>
-          <w:u w:val="single"/>
-          <w:lang w:val="es-ES"/>
-          <w14:ligatures w14:val="none"/>
-        </w:rPr>
-        <w:t xml:space="preserve"> </w:t>
-      </w:r>
-      <w:r>
-        <w:rPr>
-          <w:rFonts w:ascii="Calibri" w:eastAsia="Times New Roman" w:hAnsi="Calibri" w:cs="Times New Roman"/>
-          <w:b/>
-          <w:kern w:val="0"/>
-          <w:sz w:val="22"/>
-          <w:szCs w:val="22"/>
-          <w:u w:val="single"/>
-          <w:lang w:val="es-ES"/>
-          <w14:ligatures w14:val="none"/>
-        </w:rPr>
-        <w:t>regional</w:t>
-      </w:r>
-      <w:r>
-        <w:rPr>
-          <w:rFonts w:ascii="Calibri" w:eastAsia="Times New Roman" w:hAnsi="Calibri" w:cs="Times New Roman"/>
-          <w:b/>
-          <w:spacing w:val="-5"/>
-          <w:kern w:val="0"/>
-          <w:sz w:val="22"/>
-          <w:szCs w:val="22"/>
-          <w:u w:val="single"/>
-          <w:lang w:val="es-ES"/>
-          <w14:ligatures w14:val="none"/>
-        </w:rPr>
-        <w:t xml:space="preserve"> </w:t>
-      </w:r>
-      <w:r>
-        <w:rPr>
-          <w:rFonts w:ascii="Calibri" w:eastAsia="Times New Roman" w:hAnsi="Calibri" w:cs="Times New Roman"/>
-          <w:b/>
-          <w:kern w:val="0"/>
-          <w:sz w:val="22"/>
-          <w:szCs w:val="22"/>
-          <w:u w:val="single"/>
-          <w:lang w:val="es-ES"/>
-          <w14:ligatures w14:val="none"/>
-        </w:rPr>
-        <w:t>o</w:t>
-      </w:r>
-      <w:r>
-        <w:rPr>
-          <w:rFonts w:ascii="Calibri" w:eastAsia="Times New Roman" w:hAnsi="Calibri" w:cs="Times New Roman"/>
-          <w:b/>
-          <w:spacing w:val="-5"/>
-          <w:kern w:val="0"/>
-          <w:sz w:val="22"/>
-          <w:szCs w:val="22"/>
-          <w:u w:val="single"/>
-          <w:lang w:val="es-ES"/>
-          <w14:ligatures w14:val="none"/>
-        </w:rPr>
-        <w:t xml:space="preserve"> </w:t>
-      </w:r>
-      <w:r>
-        <w:rPr>
-          <w:rFonts w:ascii="Calibri" w:eastAsia="Times New Roman" w:hAnsi="Calibri" w:cs="Times New Roman"/>
-          <w:b/>
-          <w:kern w:val="0"/>
-          <w:sz w:val="22"/>
-          <w:szCs w:val="22"/>
-          <w:u w:val="single"/>
-          <w:lang w:val="es-ES"/>
-          <w14:ligatures w14:val="none"/>
-        </w:rPr>
-        <w:t>comunal)</w:t>
-      </w:r>
-      <w:r>
-        <w:rPr>
-          <w:rFonts w:ascii="Calibri" w:eastAsia="Times New Roman" w:hAnsi="Calibri" w:cs="Times New Roman"/>
-          <w:b/>
-          <w:spacing w:val="-6"/>
-          <w:kern w:val="0"/>
-          <w:sz w:val="22"/>
-          <w:szCs w:val="22"/>
-          <w:u w:val="single"/>
-          <w:lang w:val="es-ES"/>
-          <w14:ligatures w14:val="none"/>
-        </w:rPr>
-        <w:t xml:space="preserve"> </w:t>
-      </w:r>
-      <w:r>
-        <w:rPr>
-          <w:rFonts w:ascii="Calibri" w:eastAsia="Times New Roman" w:hAnsi="Calibri" w:cs="Times New Roman"/>
-          <w:b/>
-          <w:kern w:val="0"/>
-          <w:sz w:val="22"/>
-          <w:szCs w:val="22"/>
-          <w:u w:val="single"/>
-          <w:lang w:val="es-ES"/>
-          <w14:ligatures w14:val="none"/>
-        </w:rPr>
-        <w:t>de</w:t>
-      </w:r>
-      <w:r>
-        <w:rPr>
-          <w:rFonts w:ascii="Calibri" w:eastAsia="Times New Roman" w:hAnsi="Calibri" w:cs="Times New Roman"/>
-          <w:b/>
-          <w:spacing w:val="-7"/>
-          <w:kern w:val="0"/>
-          <w:sz w:val="22"/>
-          <w:szCs w:val="22"/>
-          <w:u w:val="single"/>
-          <w:lang w:val="es-ES"/>
-          <w14:ligatures w14:val="none"/>
-        </w:rPr>
-        <w:t xml:space="preserve"> </w:t>
-      </w:r>
-      <w:r>
-        <w:rPr>
-          <w:rFonts w:ascii="Calibri" w:eastAsia="Times New Roman" w:hAnsi="Calibri" w:cs="Times New Roman"/>
-          <w:b/>
-          <w:kern w:val="0"/>
-          <w:sz w:val="22"/>
-          <w:szCs w:val="22"/>
-          <w:u w:val="single"/>
-          <w:lang w:val="es-ES"/>
-          <w14:ligatures w14:val="none"/>
-        </w:rPr>
-        <w:t>la</w:t>
-      </w:r>
-      <w:r>
-        <w:rPr>
-          <w:rFonts w:ascii="Calibri" w:eastAsia="Times New Roman" w:hAnsi="Calibri" w:cs="Times New Roman"/>
-          <w:b/>
-          <w:spacing w:val="-5"/>
-          <w:kern w:val="0"/>
-          <w:sz w:val="22"/>
-          <w:szCs w:val="22"/>
-          <w:u w:val="single"/>
-          <w:lang w:val="es-ES"/>
-          <w14:ligatures w14:val="none"/>
-        </w:rPr>
-        <w:t xml:space="preserve"> </w:t>
-      </w:r>
-      <w:r>
-        <w:rPr>
-          <w:rFonts w:ascii="Calibri" w:eastAsia="Times New Roman" w:hAnsi="Calibri" w:cs="Times New Roman"/>
-          <w:b/>
-          <w:kern w:val="0"/>
-          <w:sz w:val="22"/>
-          <w:szCs w:val="22"/>
-          <w:u w:val="single"/>
-          <w:lang w:val="es-ES"/>
-          <w14:ligatures w14:val="none"/>
-        </w:rPr>
-        <w:t>Región</w:t>
-      </w:r>
-      <w:r>
-        <w:rPr>
-          <w:rFonts w:ascii="Calibri" w:eastAsia="Times New Roman" w:hAnsi="Calibri" w:cs="Times New Roman"/>
-          <w:b/>
-          <w:spacing w:val="-4"/>
-          <w:kern w:val="0"/>
-          <w:sz w:val="22"/>
-          <w:szCs w:val="22"/>
-          <w:u w:val="single"/>
-          <w:lang w:val="es-ES"/>
-          <w14:ligatures w14:val="none"/>
-        </w:rPr>
-        <w:t xml:space="preserve"> ……….</w:t>
-      </w:r>
-    </w:p>
-    <w:p>
-      <w:pPr>
-        <w:widowControl w:val="0"/>
-        <w:autoSpaceDE w:val="0"/>
-        <w:autoSpaceDN w:val="0"/>
-        <w:spacing w:before="183"/>
-        <w:ind w:left="622"/>
-        <w:rPr>
-          <w:rFonts w:ascii="Calibri" w:eastAsia="Times New Roman" w:hAnsi="Times New Roman" w:cs="Times New Roman"/>
-          <w:b/>
-          <w:kern w:val="0"/>
-          <w:sz w:val="22"/>
-          <w:szCs w:val="22"/>
-          <w:lang w:val="es-ES"/>
-          <w14:ligatures w14:val="none"/>
-        </w:rPr>
-      </w:pPr>
-      <w:r>
-        <w:rPr>
-          <w:rFonts w:ascii="Calibri" w:eastAsia="Times New Roman" w:hAnsi="Times New Roman" w:cs="Times New Roman"/>
-          <w:b/>
-          <w:kern w:val="0"/>
-          <w:sz w:val="22"/>
-          <w:szCs w:val="22"/>
-          <w:lang w:val="es-ES"/>
-          <w14:ligatures w14:val="none"/>
-        </w:rPr>
-        <w:t>Cargo</w:t>
-      </w:r>
-      <w:r>
-        <w:rPr>
-          <w:rFonts w:ascii="Calibri" w:eastAsia="Times New Roman" w:hAnsi="Times New Roman" w:cs="Times New Roman"/>
-          <w:b/>
-          <w:spacing w:val="-2"/>
-          <w:kern w:val="0"/>
-          <w:sz w:val="22"/>
-          <w:szCs w:val="22"/>
-          <w:lang w:val="es-ES"/>
-          <w14:ligatures w14:val="none"/>
-        </w:rPr>
-        <w:t xml:space="preserve"> </w:t>
-      </w:r>
-      <w:r>
-        <w:rPr>
-          <w:rFonts w:ascii="Calibri" w:eastAsia="Times New Roman" w:hAnsi="Times New Roman" w:cs="Times New Roman"/>
-          <w:b/>
-          <w:kern w:val="0"/>
-          <w:sz w:val="22"/>
-          <w:szCs w:val="22"/>
-          <w:lang w:val="es-ES"/>
-          <w14:ligatures w14:val="none"/>
-        </w:rPr>
-        <w:t>al</w:t>
-      </w:r>
-      <w:r>
-        <w:rPr>
-          <w:rFonts w:ascii="Calibri" w:eastAsia="Times New Roman" w:hAnsi="Times New Roman" w:cs="Times New Roman"/>
-          <w:b/>
-          <w:spacing w:val="-3"/>
-          <w:kern w:val="0"/>
-          <w:sz w:val="22"/>
-          <w:szCs w:val="22"/>
-          <w:lang w:val="es-ES"/>
-          <w14:ligatures w14:val="none"/>
-        </w:rPr>
-        <w:t xml:space="preserve"> </w:t>
-      </w:r>
-      <w:r>
-        <w:rPr>
-          <w:rFonts w:ascii="Calibri" w:eastAsia="Times New Roman" w:hAnsi="Times New Roman" w:cs="Times New Roman"/>
-          <w:b/>
-          <w:kern w:val="0"/>
-          <w:sz w:val="22"/>
-          <w:szCs w:val="22"/>
-          <w:lang w:val="es-ES"/>
-          <w14:ligatures w14:val="none"/>
-        </w:rPr>
-        <w:t>que</w:t>
-      </w:r>
-      <w:r>
-        <w:rPr>
-          <w:rFonts w:ascii="Calibri" w:eastAsia="Times New Roman" w:hAnsi="Times New Roman" w:cs="Times New Roman"/>
-          <w:b/>
-          <w:spacing w:val="-1"/>
-          <w:kern w:val="0"/>
-          <w:sz w:val="22"/>
-          <w:szCs w:val="22"/>
-          <w:lang w:val="es-ES"/>
-          <w14:ligatures w14:val="none"/>
-        </w:rPr>
-        <w:t xml:space="preserve"> </w:t>
-      </w:r>
-      <w:r>
-        <w:rPr>
-          <w:rFonts w:ascii="Calibri" w:eastAsia="Times New Roman" w:hAnsi="Times New Roman" w:cs="Times New Roman"/>
-          <w:b/>
-          <w:kern w:val="0"/>
-          <w:sz w:val="22"/>
-          <w:szCs w:val="22"/>
-          <w:lang w:val="es-ES"/>
-          <w14:ligatures w14:val="none"/>
-        </w:rPr>
-        <w:t>se</w:t>
-      </w:r>
-      <w:r>
-        <w:rPr>
-          <w:rFonts w:ascii="Calibri" w:eastAsia="Times New Roman" w:hAnsi="Times New Roman" w:cs="Times New Roman"/>
-          <w:b/>
-          <w:spacing w:val="-1"/>
-          <w:kern w:val="0"/>
-          <w:sz w:val="22"/>
-          <w:szCs w:val="22"/>
-          <w:lang w:val="es-ES"/>
-          <w14:ligatures w14:val="none"/>
-        </w:rPr>
-        <w:t xml:space="preserve"> </w:t>
-      </w:r>
-      <w:r>
-        <w:rPr>
-          <w:rFonts w:ascii="Calibri" w:eastAsia="Times New Roman" w:hAnsi="Times New Roman" w:cs="Times New Roman"/>
-          <w:b/>
-          <w:spacing w:val="-2"/>
-          <w:kern w:val="0"/>
-          <w:sz w:val="22"/>
-          <w:szCs w:val="22"/>
-          <w:lang w:val="es-ES"/>
-          <w14:ligatures w14:val="none"/>
-        </w:rPr>
-        <w:t>postula:</w:t>
+        <w:t>Región de ………………………</w:t>
       </w:r>
     </w:p>
     <w:p>
@@ -1050,7 +730,7 @@
       </w:tr>
       <w:tr>
         <w:trPr>
-          <w:trHeight w:val="453"/>
+          <w:trHeight w:val="1323"/>
         </w:trPr>
         <w:tc>
           <w:tcPr>
@@ -1661,7 +1341,7 @@
       </w:tr>
       <w:tr>
         <w:trPr>
-          <w:trHeight w:val="455"/>
+          <w:trHeight w:val="1342"/>
         </w:trPr>
         <w:tc>
           <w:tcPr>
@@ -1734,6 +1414,40 @@
           <w14:ligatures w14:val="none"/>
         </w:rPr>
       </w:pPr>
+      <w:r>
+        <w:rPr>
+          <w:rFonts w:ascii="Calibri" w:eastAsia="Times New Roman" w:hAnsi="Times New Roman" w:cs="Times New Roman"/>
+          <w:b/>
+          <w:kern w:val="0"/>
+          <w:sz w:val="20"/>
+          <w:lang w:val="es-ES"/>
+          <w14:ligatures w14:val="none"/>
+        </w:rPr>
+        <w:br/>
+      </w:r>
+    </w:p>
+    <w:p>
+      <w:pPr>
+        <w:rPr>
+          <w:rFonts w:ascii="Calibri" w:eastAsia="Times New Roman" w:hAnsi="Times New Roman" w:cs="Times New Roman"/>
+          <w:b/>
+          <w:kern w:val="0"/>
+          <w:sz w:val="20"/>
+          <w:lang w:val="es-ES"/>
+          <w14:ligatures w14:val="none"/>
+        </w:rPr>
+      </w:pPr>
+      <w:r>
+        <w:rPr>
+          <w:rFonts w:ascii="Calibri" w:eastAsia="Times New Roman" w:hAnsi="Times New Roman" w:cs="Times New Roman"/>
+          <w:b/>
+          <w:kern w:val="0"/>
+          <w:sz w:val="20"/>
+          <w:lang w:val="es-ES"/>
+          <w14:ligatures w14:val="none"/>
+        </w:rPr>
+        <w:br w:type="page"/>
+      </w:r>
     </w:p>
     <w:tbl>
       <w:tblPr>
@@ -1791,6 +1505,7 @@
                 <w:lang w:val="es-ES"/>
                 <w14:ligatures w14:val="none"/>
               </w:rPr>
+              <w:lastRenderedPageBreak/>
               <w:t>Nombre</w:t>
             </w:r>
             <w:r>
@@ -2272,7 +1987,7 @@
       </w:tr>
       <w:tr>
         <w:trPr>
-          <w:trHeight w:val="453"/>
+          <w:trHeight w:val="1235"/>
         </w:trPr>
         <w:tc>
           <w:tcPr>
@@ -2335,25 +2050,47 @@
         <w:widowControl w:val="0"/>
         <w:autoSpaceDE w:val="0"/>
         <w:autoSpaceDN w:val="0"/>
+        <w:spacing w:before="10"/>
         <w:rPr>
-          <w:rFonts w:ascii="Times New Roman" w:eastAsia="Times New Roman" w:hAnsi="Times New Roman" w:cs="Times New Roman"/>
+          <w:rFonts w:ascii="Calibri" w:eastAsia="Times New Roman" w:hAnsi="Times New Roman" w:cs="Times New Roman"/>
+          <w:b/>
           <w:kern w:val="0"/>
-          <w:sz w:val="22"/>
-          <w:szCs w:val="22"/>
+          <w:sz w:val="7"/>
           <w:lang w:val="es-ES"/>
           <w14:ligatures w14:val="none"/>
         </w:rPr>
-        <w:sectPr>
-          <w:headerReference w:type="even" r:id="rId6"/>
-          <w:headerReference w:type="default" r:id="rId7"/>
-          <w:footerReference w:type="even" r:id="rId8"/>
-          <w:footerReference w:type="default" r:id="rId9"/>
-          <w:headerReference w:type="first" r:id="rId10"/>
-          <w:footerReference w:type="first" r:id="rId11"/>
-          <w:pgSz w:w="12240" w:h="15840"/>
-          <w:pgMar w:top="1320" w:right="1080" w:bottom="280" w:left="1080" w:header="730" w:footer="0" w:gutter="0"/>
-          <w:cols w:space="720"/>
-        </w:sectPr>
+      </w:pPr>
+    </w:p>
+    <w:p>
+      <w:pPr>
+        <w:widowControl w:val="0"/>
+        <w:autoSpaceDE w:val="0"/>
+        <w:autoSpaceDN w:val="0"/>
+        <w:spacing w:before="10"/>
+        <w:rPr>
+          <w:rFonts w:ascii="Calibri" w:eastAsia="Times New Roman" w:hAnsi="Times New Roman" w:cs="Times New Roman"/>
+          <w:b/>
+          <w:kern w:val="0"/>
+          <w:sz w:val="7"/>
+          <w:lang w:val="es-ES"/>
+          <w14:ligatures w14:val="none"/>
+        </w:rPr>
+      </w:pPr>
+    </w:p>
+    <w:p>
+      <w:pPr>
+        <w:widowControl w:val="0"/>
+        <w:autoSpaceDE w:val="0"/>
+        <w:autoSpaceDN w:val="0"/>
+        <w:spacing w:before="10"/>
+        <w:rPr>
+          <w:rFonts w:ascii="Calibri" w:eastAsia="Times New Roman" w:hAnsi="Times New Roman" w:cs="Times New Roman"/>
+          <w:b/>
+          <w:kern w:val="0"/>
+          <w:sz w:val="7"/>
+          <w:lang w:val="es-ES"/>
+          <w14:ligatures w14:val="none"/>
+        </w:rPr>
       </w:pPr>
     </w:p>
     <w:p>
@@ -2909,7 +2646,7 @@
       </w:tr>
       <w:tr>
         <w:trPr>
-          <w:trHeight w:val="455"/>
+          <w:trHeight w:val="1227"/>
         </w:trPr>
         <w:tc>
           <w:tcPr>
@@ -2967,6 +2704,56 @@
         </w:tc>
       </w:tr>
     </w:tbl>
+    <w:p>
+      <w:pPr>
+        <w:widowControl w:val="0"/>
+        <w:autoSpaceDE w:val="0"/>
+        <w:autoSpaceDN w:val="0"/>
+        <w:spacing w:before="206" w:after="1"/>
+        <w:rPr>
+          <w:rFonts w:ascii="Calibri" w:eastAsia="Times New Roman" w:hAnsi="Times New Roman" w:cs="Times New Roman"/>
+          <w:b/>
+          <w:kern w:val="0"/>
+          <w:sz w:val="20"/>
+          <w:lang w:val="es-ES"/>
+          <w14:ligatures w14:val="none"/>
+        </w:rPr>
+      </w:pPr>
+      <w:r>
+        <w:rPr>
+          <w:rFonts w:ascii="Calibri" w:eastAsia="Times New Roman" w:hAnsi="Times New Roman" w:cs="Times New Roman"/>
+          <w:b/>
+          <w:kern w:val="0"/>
+          <w:sz w:val="20"/>
+          <w:lang w:val="es-ES"/>
+          <w14:ligatures w14:val="none"/>
+        </w:rPr>
+        <w:br/>
+      </w:r>
+    </w:p>
+    <w:p>
+      <w:pPr>
+        <w:rPr>
+          <w:rFonts w:ascii="Calibri" w:eastAsia="Times New Roman" w:hAnsi="Times New Roman" w:cs="Times New Roman"/>
+          <w:b/>
+          <w:kern w:val="0"/>
+          <w:sz w:val="20"/>
+          <w:lang w:val="es-ES"/>
+          <w14:ligatures w14:val="none"/>
+        </w:rPr>
+      </w:pPr>
+      <w:r>
+        <w:rPr>
+          <w:rFonts w:ascii="Calibri" w:eastAsia="Times New Roman" w:hAnsi="Times New Roman" w:cs="Times New Roman"/>
+          <w:b/>
+          <w:kern w:val="0"/>
+          <w:sz w:val="20"/>
+          <w:lang w:val="es-ES"/>
+          <w14:ligatures w14:val="none"/>
+        </w:rPr>
+        <w:br w:type="page"/>
+      </w:r>
+    </w:p>
     <w:p>
       <w:pPr>
         <w:widowControl w:val="0"/>
@@ -3520,7 +3307,7 @@
       </w:tr>
       <w:tr>
         <w:trPr>
-          <w:trHeight w:val="453"/>
+          <w:trHeight w:val="1423"/>
         </w:trPr>
         <w:tc>
           <w:tcPr>
@@ -3580,6 +3367,12 @@
     </w:tbl>
     <w:p/>
     <w:sectPr>
+      <w:headerReference w:type="even" r:id="rId6"/>
+      <w:headerReference w:type="default" r:id="rId7"/>
+      <w:footerReference w:type="even" r:id="rId8"/>
+      <w:footerReference w:type="default" r:id="rId9"/>
+      <w:headerReference w:type="first" r:id="rId10"/>
+      <w:footerReference w:type="first" r:id="rId11"/>
       <w:pgSz w:w="12240" w:h="15840"/>
       <w:pgMar w:top="1440" w:right="1440" w:bottom="1440" w:left="1440" w:header="720" w:footer="720" w:gutter="0"/>
       <w:cols w:space="720"/>
@@ -3612,7 +3405,7 @@
 <w:ftr xmlns:wpc="http://schemas.microsoft.com/office/word/2010/wordprocessingCanvas" xmlns:cx="http://schemas.microsoft.com/office/drawing/2014/chartex" xmlns:cx1="http://schemas.microsoft.com/office/drawing/2015/9/8/chartex" xmlns:cx2="http://schemas.microsoft.com/office/drawing/2015/10/21/chartex" xmlns:cx3="http://schemas.microsoft.com/office/drawing/2016/5/9/chartex" xmlns:cx4="http://schemas.microsoft.com/office/drawing/2016/5/10/chartex" xmlns:cx5="http://schemas.microsoft.com/office/drawing/2016/5/11/chartex" xmlns:cx6="http://schemas.microsoft.com/office/drawing/2016/5/12/chartex" xmlns:cx7="http://schemas.microsoft.com/office/drawing/2016/5/13/chartex" xmlns:cx8="http://schemas.microsoft.com/office/drawing/2016/5/14/chartex" xmlns:mc="http://schemas.openxmlformats.org/markup-compatibility/2006" xmlns:aink="http://schemas.microsoft.com/office/drawing/2016/ink" xmlns:am3d="http://schemas.microsoft.com/office/drawing/2017/model3d" xmlns:o="urn:schemas-microsoft-com:office:office" xmlns:oel="http://schemas.microsoft.com/office/2019/extlst" xmlns:r="http://schemas.openxmlformats.org/officeDocument/2006/relationships" xmlns:m="http://schemas.openxmlformats.org/officeDocument/2006/math" xmlns:v="urn:schemas-microsoft-com:vml" xmlns:wp14="http://schemas.microsoft.com/office/word/2010/wordprocessingDrawing" xmlns:wp="http://schemas.openxmlformats.org/drawingml/2006/wordprocessingDrawing" xmlns:w10="urn:schemas-microsoft-com:office:word" xmlns:w="http://schemas.openxmlformats.org/wordprocessingml/2006/main" xmlns:w14="http://schemas.microsoft.com/office/word/2010/wordml" xmlns:w15="http://schemas.microsoft.com/office/word/2012/wordml" xmlns:w16cex="http://schemas.microsoft.com/office/word/2018/wordml/cex" xmlns:w16cid="http://schemas.microsoft.com/office/word/2016/wordml/cid" xmlns:w16="http://schemas.microsoft.com/office/word/2018/wordml" xmlns:w16du="http://schemas.microsoft.com/office/word/2023/wordml/word16du" xmlns:w16sdtdh="http://schemas.microsoft.com/office/word/2020/wordml/sdtdatahash" xmlns:w16sdtfl="http://schemas.microsoft.com/office/word/2024/wordml/sdtformatlock" xmlns:w16se="http://schemas.microsoft.com/office/word/2015/wordml/symex" xmlns:wpg="http://schemas.microsoft.com/office/word/2010/wordprocessingGroup" xmlns:wpi="http://schemas.microsoft.com/office/word/2010/wordprocessingInk" xmlns:wne="http://schemas.microsoft.com/office/word/2006/wordml" xmlns:wps="http://schemas.microsoft.com/office/word/2010/wordprocessingShape" mc:Ignorable="w14 w15 w16se w16cid w16 w16cex w16sdtdh w16sdtfl w16du wp14">
   <w:p>
     <w:pPr>
-      <w:pStyle w:val="Footer"/>
+      <w:pStyle w:val="Piedepgina"/>
     </w:pPr>
   </w:p>
 </w:ftr>
@@ -3622,7 +3415,7 @@
 <w:ftr xmlns:wpc="http://schemas.microsoft.com/office/word/2010/wordprocessingCanvas" xmlns:cx="http://schemas.microsoft.com/office/drawing/2014/chartex" xmlns:cx1="http://schemas.microsoft.com/office/drawing/2015/9/8/chartex" xmlns:cx2="http://schemas.microsoft.com/office/drawing/2015/10/21/chartex" xmlns:cx3="http://schemas.microsoft.com/office/drawing/2016/5/9/chartex" xmlns:cx4="http://schemas.microsoft.com/office/drawing/2016/5/10/chartex" xmlns:cx5="http://schemas.microsoft.com/office/drawing/2016/5/11/chartex" xmlns:cx6="http://schemas.microsoft.com/office/drawing/2016/5/12/chartex" xmlns:cx7="http://schemas.microsoft.com/office/drawing/2016/5/13/chartex" xmlns:cx8="http://schemas.microsoft.com/office/drawing/2016/5/14/chartex" xmlns:mc="http://schemas.openxmlformats.org/markup-compatibility/2006" xmlns:aink="http://schemas.microsoft.com/office/drawing/2016/ink" xmlns:am3d="http://schemas.microsoft.com/office/drawing/2017/model3d" xmlns:o="urn:schemas-microsoft-com:office:office" xmlns:oel="http://schemas.microsoft.com/office/2019/extlst" xmlns:r="http://schemas.openxmlformats.org/officeDocument/2006/relationships" xmlns:m="http://schemas.openxmlformats.org/officeDocument/2006/math" xmlns:v="urn:schemas-microsoft-com:vml" xmlns:wp14="http://schemas.microsoft.com/office/word/2010/wordprocessingDrawing" xmlns:wp="http://schemas.openxmlformats.org/drawingml/2006/wordprocessingDrawing" xmlns:w10="urn:schemas-microsoft-com:office:word" xmlns:w="http://schemas.openxmlformats.org/wordprocessingml/2006/main" xmlns:w14="http://schemas.microsoft.com/office/word/2010/wordml" xmlns:w15="http://schemas.microsoft.com/office/word/2012/wordml" xmlns:w16cex="http://schemas.microsoft.com/office/word/2018/wordml/cex" xmlns:w16cid="http://schemas.microsoft.com/office/word/2016/wordml/cid" xmlns:w16="http://schemas.microsoft.com/office/word/2018/wordml" xmlns:w16du="http://schemas.microsoft.com/office/word/2023/wordml/word16du" xmlns:w16sdtdh="http://schemas.microsoft.com/office/word/2020/wordml/sdtdatahash" xmlns:w16sdtfl="http://schemas.microsoft.com/office/word/2024/wordml/sdtformatlock" xmlns:w16se="http://schemas.microsoft.com/office/word/2015/wordml/symex" xmlns:wpg="http://schemas.microsoft.com/office/word/2010/wordprocessingGroup" xmlns:wpi="http://schemas.microsoft.com/office/word/2010/wordprocessingInk" xmlns:wne="http://schemas.microsoft.com/office/word/2006/wordml" xmlns:wps="http://schemas.microsoft.com/office/word/2010/wordprocessingShape" mc:Ignorable="w14 w15 w16se w16cid w16 w16cex w16sdtdh w16sdtfl w16du wp14">
   <w:p>
     <w:pPr>
-      <w:pStyle w:val="Footer"/>
+      <w:pStyle w:val="Piedepgina"/>
     </w:pPr>
   </w:p>
 </w:ftr>
@@ -3632,7 +3425,7 @@
 <w:ftr xmlns:wpc="http://schemas.microsoft.com/office/word/2010/wordprocessingCanvas" xmlns:cx="http://schemas.microsoft.com/office/drawing/2014/chartex" xmlns:cx1="http://schemas.microsoft.com/office/drawing/2015/9/8/chartex" xmlns:cx2="http://schemas.microsoft.com/office/drawing/2015/10/21/chartex" xmlns:cx3="http://schemas.microsoft.com/office/drawing/2016/5/9/chartex" xmlns:cx4="http://schemas.microsoft.com/office/drawing/2016/5/10/chartex" xmlns:cx5="http://schemas.microsoft.com/office/drawing/2016/5/11/chartex" xmlns:cx6="http://schemas.microsoft.com/office/drawing/2016/5/12/chartex" xmlns:cx7="http://schemas.microsoft.com/office/drawing/2016/5/13/chartex" xmlns:cx8="http://schemas.microsoft.com/office/drawing/2016/5/14/chartex" xmlns:mc="http://schemas.openxmlformats.org/markup-compatibility/2006" xmlns:aink="http://schemas.microsoft.com/office/drawing/2016/ink" xmlns:am3d="http://schemas.microsoft.com/office/drawing/2017/model3d" xmlns:o="urn:schemas-microsoft-com:office:office" xmlns:oel="http://schemas.microsoft.com/office/2019/extlst" xmlns:r="http://schemas.openxmlformats.org/officeDocument/2006/relationships" xmlns:m="http://schemas.openxmlformats.org/officeDocument/2006/math" xmlns:v="urn:schemas-microsoft-com:vml" xmlns:wp14="http://schemas.microsoft.com/office/word/2010/wordprocessingDrawing" xmlns:wp="http://schemas.openxmlformats.org/drawingml/2006/wordprocessingDrawing" xmlns:w10="urn:schemas-microsoft-com:office:word" xmlns:w="http://schemas.openxmlformats.org/wordprocessingml/2006/main" xmlns:w14="http://schemas.microsoft.com/office/word/2010/wordml" xmlns:w15="http://schemas.microsoft.com/office/word/2012/wordml" xmlns:w16cex="http://schemas.microsoft.com/office/word/2018/wordml/cex" xmlns:w16cid="http://schemas.microsoft.com/office/word/2016/wordml/cid" xmlns:w16="http://schemas.microsoft.com/office/word/2018/wordml" xmlns:w16du="http://schemas.microsoft.com/office/word/2023/wordml/word16du" xmlns:w16sdtdh="http://schemas.microsoft.com/office/word/2020/wordml/sdtdatahash" xmlns:w16sdtfl="http://schemas.microsoft.com/office/word/2024/wordml/sdtformatlock" xmlns:w16se="http://schemas.microsoft.com/office/word/2015/wordml/symex" xmlns:wpg="http://schemas.microsoft.com/office/word/2010/wordprocessingGroup" xmlns:wpi="http://schemas.microsoft.com/office/word/2010/wordprocessingInk" xmlns:wne="http://schemas.microsoft.com/office/word/2006/wordml" xmlns:wps="http://schemas.microsoft.com/office/word/2010/wordprocessingShape" mc:Ignorable="w14 w15 w16se w16cid w16 w16cex w16sdtdh w16sdtfl w16du wp14">
   <w:p>
     <w:pPr>
-      <w:pStyle w:val="Footer"/>
+      <w:pStyle w:val="Piedepgina"/>
     </w:pPr>
   </w:p>
 </w:ftr>
@@ -3661,7 +3454,7 @@
 <w:hdr xmlns:wpc="http://schemas.microsoft.com/office/word/2010/wordprocessingCanvas" xmlns:cx="http://schemas.microsoft.com/office/drawing/2014/chartex" xmlns:cx1="http://schemas.microsoft.com/office/drawing/2015/9/8/chartex" xmlns:cx2="http://schemas.microsoft.com/office/drawing/2015/10/21/chartex" xmlns:cx3="http://schemas.microsoft.com/office/drawing/2016/5/9/chartex" xmlns:cx4="http://schemas.microsoft.com/office/drawing/2016/5/10/chartex" xmlns:cx5="http://schemas.microsoft.com/office/drawing/2016/5/11/chartex" xmlns:cx6="http://schemas.microsoft.com/office/drawing/2016/5/12/chartex" xmlns:cx7="http://schemas.microsoft.com/office/drawing/2016/5/13/chartex" xmlns:cx8="http://schemas.microsoft.com/office/drawing/2016/5/14/chartex" xmlns:mc="http://schemas.openxmlformats.org/markup-compatibility/2006" xmlns:aink="http://schemas.microsoft.com/office/drawing/2016/ink" xmlns:am3d="http://schemas.microsoft.com/office/drawing/2017/model3d" xmlns:o="urn:schemas-microsoft-com:office:office" xmlns:oel="http://schemas.microsoft.com/office/2019/extlst" xmlns:r="http://schemas.openxmlformats.org/officeDocument/2006/relationships" xmlns:m="http://schemas.openxmlformats.org/officeDocument/2006/math" xmlns:v="urn:schemas-microsoft-com:vml" xmlns:wp14="http://schemas.microsoft.com/office/word/2010/wordprocessingDrawing" xmlns:wp="http://schemas.openxmlformats.org/drawingml/2006/wordprocessingDrawing" xmlns:w10="urn:schemas-microsoft-com:office:word" xmlns:w="http://schemas.openxmlformats.org/wordprocessingml/2006/main" xmlns:w14="http://schemas.microsoft.com/office/word/2010/wordml" xmlns:w15="http://schemas.microsoft.com/office/word/2012/wordml" xmlns:w16cex="http://schemas.microsoft.com/office/word/2018/wordml/cex" xmlns:w16cid="http://schemas.microsoft.com/office/word/2016/wordml/cid" xmlns:w16="http://schemas.microsoft.com/office/word/2018/wordml" xmlns:w16du="http://schemas.microsoft.com/office/word/2023/wordml/word16du" xmlns:w16sdtdh="http://schemas.microsoft.com/office/word/2020/wordml/sdtdatahash" xmlns:w16sdtfl="http://schemas.microsoft.com/office/word/2024/wordml/sdtformatlock" xmlns:w16se="http://schemas.microsoft.com/office/word/2015/wordml/symex" xmlns:wpg="http://schemas.microsoft.com/office/word/2010/wordprocessingGroup" xmlns:wpi="http://schemas.microsoft.com/office/word/2010/wordprocessingInk" xmlns:wne="http://schemas.microsoft.com/office/word/2006/wordml" xmlns:wps="http://schemas.microsoft.com/office/word/2010/wordprocessingShape" mc:Ignorable="w14 w15 w16se w16cid w16 w16cex w16sdtdh w16sdtfl w16du wp14">
   <w:p>
     <w:pPr>
-      <w:pStyle w:val="Header"/>
+      <w:pStyle w:val="Encabezado"/>
     </w:pPr>
   </w:p>
 </w:hdr>
@@ -3671,7 +3464,7 @@
 <w:hdr xmlns:wpc="http://schemas.microsoft.com/office/word/2010/wordprocessingCanvas" xmlns:cx="http://schemas.microsoft.com/office/drawing/2014/chartex" xmlns:cx1="http://schemas.microsoft.com/office/drawing/2015/9/8/chartex" xmlns:cx2="http://schemas.microsoft.com/office/drawing/2015/10/21/chartex" xmlns:cx3="http://schemas.microsoft.com/office/drawing/2016/5/9/chartex" xmlns:cx4="http://schemas.microsoft.com/office/drawing/2016/5/10/chartex" xmlns:cx5="http://schemas.microsoft.com/office/drawing/2016/5/11/chartex" xmlns:cx6="http://schemas.microsoft.com/office/drawing/2016/5/12/chartex" xmlns:cx7="http://schemas.microsoft.com/office/drawing/2016/5/13/chartex" xmlns:cx8="http://schemas.microsoft.com/office/drawing/2016/5/14/chartex" xmlns:mc="http://schemas.openxmlformats.org/markup-compatibility/2006" xmlns:aink="http://schemas.microsoft.com/office/drawing/2016/ink" xmlns:am3d="http://schemas.microsoft.com/office/drawing/2017/model3d" xmlns:o="urn:schemas-microsoft-com:office:office" xmlns:oel="http://schemas.microsoft.com/office/2019/extlst" xmlns:r="http://schemas.openxmlformats.org/officeDocument/2006/relationships" xmlns:m="http://schemas.openxmlformats.org/officeDocument/2006/math" xmlns:v="urn:schemas-microsoft-com:vml" xmlns:wp14="http://schemas.microsoft.com/office/word/2010/wordprocessingDrawing" xmlns:wp="http://schemas.openxmlformats.org/drawingml/2006/wordprocessingDrawing" xmlns:w10="urn:schemas-microsoft-com:office:word" xmlns:w="http://schemas.openxmlformats.org/wordprocessingml/2006/main" xmlns:w14="http://schemas.microsoft.com/office/word/2010/wordml" xmlns:w15="http://schemas.microsoft.com/office/word/2012/wordml" xmlns:w16cex="http://schemas.microsoft.com/office/word/2018/wordml/cex" xmlns:w16cid="http://schemas.microsoft.com/office/word/2016/wordml/cid" xmlns:w16="http://schemas.microsoft.com/office/word/2018/wordml" xmlns:w16du="http://schemas.microsoft.com/office/word/2023/wordml/word16du" xmlns:w16sdtdh="http://schemas.microsoft.com/office/word/2020/wordml/sdtdatahash" xmlns:w16sdtfl="http://schemas.microsoft.com/office/word/2024/wordml/sdtformatlock" xmlns:w16se="http://schemas.microsoft.com/office/word/2015/wordml/symex" xmlns:wpg="http://schemas.microsoft.com/office/word/2010/wordprocessingGroup" xmlns:wpi="http://schemas.microsoft.com/office/word/2010/wordprocessingInk" xmlns:wne="http://schemas.microsoft.com/office/word/2006/wordml" xmlns:wps="http://schemas.microsoft.com/office/word/2010/wordprocessingShape" mc:Ignorable="w14 w15 w16se w16cid w16 w16cex w16sdtdh w16sdtfl w16du wp14">
   <w:p>
     <w:pPr>
-      <w:pStyle w:val="BodyText"/>
+      <w:pStyle w:val="Textoindependiente"/>
       <w:spacing w:line="14" w:lineRule="auto"/>
       <w:rPr>
         <w:sz w:val="20"/>
@@ -3734,7 +3527,7 @@
 <w:hdr xmlns:wpc="http://schemas.microsoft.com/office/word/2010/wordprocessingCanvas" xmlns:cx="http://schemas.microsoft.com/office/drawing/2014/chartex" xmlns:cx1="http://schemas.microsoft.com/office/drawing/2015/9/8/chartex" xmlns:cx2="http://schemas.microsoft.com/office/drawing/2015/10/21/chartex" xmlns:cx3="http://schemas.microsoft.com/office/drawing/2016/5/9/chartex" xmlns:cx4="http://schemas.microsoft.com/office/drawing/2016/5/10/chartex" xmlns:cx5="http://schemas.microsoft.com/office/drawing/2016/5/11/chartex" xmlns:cx6="http://schemas.microsoft.com/office/drawing/2016/5/12/chartex" xmlns:cx7="http://schemas.microsoft.com/office/drawing/2016/5/13/chartex" xmlns:cx8="http://schemas.microsoft.com/office/drawing/2016/5/14/chartex" xmlns:mc="http://schemas.openxmlformats.org/markup-compatibility/2006" xmlns:aink="http://schemas.microsoft.com/office/drawing/2016/ink" xmlns:am3d="http://schemas.microsoft.com/office/drawing/2017/model3d" xmlns:o="urn:schemas-microsoft-com:office:office" xmlns:oel="http://schemas.microsoft.com/office/2019/extlst" xmlns:r="http://schemas.openxmlformats.org/officeDocument/2006/relationships" xmlns:m="http://schemas.openxmlformats.org/officeDocument/2006/math" xmlns:v="urn:schemas-microsoft-com:vml" xmlns:wp14="http://schemas.microsoft.com/office/word/2010/wordprocessingDrawing" xmlns:wp="http://schemas.openxmlformats.org/drawingml/2006/wordprocessingDrawing" xmlns:w10="urn:schemas-microsoft-com:office:word" xmlns:w="http://schemas.openxmlformats.org/wordprocessingml/2006/main" xmlns:w14="http://schemas.microsoft.com/office/word/2010/wordml" xmlns:w15="http://schemas.microsoft.com/office/word/2012/wordml" xmlns:w16cex="http://schemas.microsoft.com/office/word/2018/wordml/cex" xmlns:w16cid="http://schemas.microsoft.com/office/word/2016/wordml/cid" xmlns:w16="http://schemas.microsoft.com/office/word/2018/wordml" xmlns:w16du="http://schemas.microsoft.com/office/word/2023/wordml/word16du" xmlns:w16sdtdh="http://schemas.microsoft.com/office/word/2020/wordml/sdtdatahash" xmlns:w16sdtfl="http://schemas.microsoft.com/office/word/2024/wordml/sdtformatlock" xmlns:w16se="http://schemas.microsoft.com/office/word/2015/wordml/symex" xmlns:wpg="http://schemas.microsoft.com/office/word/2010/wordprocessingGroup" xmlns:wpi="http://schemas.microsoft.com/office/word/2010/wordprocessingInk" xmlns:wne="http://schemas.microsoft.com/office/word/2006/wordml" xmlns:wps="http://schemas.microsoft.com/office/word/2010/wordprocessingShape" mc:Ignorable="w14 w15 w16se w16cid w16 w16cex w16sdtdh w16sdtfl w16du wp14">
   <w:p>
     <w:pPr>
-      <w:pStyle w:val="Header"/>
+      <w:pStyle w:val="Encabezado"/>
     </w:pPr>
   </w:p>
 </w:hdr>
@@ -4140,11 +3933,11 @@
       <w:lang w:val="es-CL"/>
     </w:rPr>
   </w:style>
-  <w:style w:type="paragraph" w:styleId="Heading1">
+  <w:style w:type="paragraph" w:styleId="Ttulo1">
     <w:name w:val="heading 1"/>
     <w:basedOn w:val="Normal"/>
     <w:next w:val="Normal"/>
-    <w:link w:val="Heading1Char"/>
+    <w:link w:val="Ttulo1Car"/>
     <w:uiPriority w:val="9"/>
     <w:qFormat/>
     <w:rsid w:val="00111D5C"/>
@@ -4161,11 +3954,11 @@
       <w:szCs w:val="40"/>
     </w:rPr>
   </w:style>
-  <w:style w:type="paragraph" w:styleId="Heading2">
+  <w:style w:type="paragraph" w:styleId="Ttulo2">
     <w:name w:val="heading 2"/>
     <w:basedOn w:val="Normal"/>
     <w:next w:val="Normal"/>
-    <w:link w:val="Heading2Char"/>
+    <w:link w:val="Ttulo2Car"/>
     <w:uiPriority w:val="9"/>
     <w:semiHidden/>
     <w:unhideWhenUsed/>
@@ -4184,11 +3977,11 @@
       <w:szCs w:val="32"/>
     </w:rPr>
   </w:style>
-  <w:style w:type="paragraph" w:styleId="Heading3">
+  <w:style w:type="paragraph" w:styleId="Ttulo3">
     <w:name w:val="heading 3"/>
     <w:basedOn w:val="Normal"/>
     <w:next w:val="Normal"/>
-    <w:link w:val="Heading3Char"/>
+    <w:link w:val="Ttulo3Car"/>
     <w:uiPriority w:val="9"/>
     <w:semiHidden/>
     <w:unhideWhenUsed/>
@@ -4207,11 +4000,11 @@
       <w:szCs w:val="28"/>
     </w:rPr>
   </w:style>
-  <w:style w:type="paragraph" w:styleId="Heading4">
+  <w:style w:type="paragraph" w:styleId="Ttulo4">
     <w:name w:val="heading 4"/>
     <w:basedOn w:val="Normal"/>
     <w:next w:val="Normal"/>
-    <w:link w:val="Heading4Char"/>
+    <w:link w:val="Ttulo4Car"/>
     <w:uiPriority w:val="9"/>
     <w:semiHidden/>
     <w:unhideWhenUsed/>
@@ -4230,11 +4023,11 @@
       <w:color w:val="0F4761" w:themeColor="accent1" w:themeShade="BF"/>
     </w:rPr>
   </w:style>
-  <w:style w:type="paragraph" w:styleId="Heading5">
+  <w:style w:type="paragraph" w:styleId="Ttulo5">
     <w:name w:val="heading 5"/>
     <w:basedOn w:val="Normal"/>
     <w:next w:val="Normal"/>
-    <w:link w:val="Heading5Char"/>
+    <w:link w:val="Ttulo5Car"/>
     <w:uiPriority w:val="9"/>
     <w:semiHidden/>
     <w:unhideWhenUsed/>
@@ -4251,11 +4044,11 @@
       <w:color w:val="0F4761" w:themeColor="accent1" w:themeShade="BF"/>
     </w:rPr>
   </w:style>
-  <w:style w:type="paragraph" w:styleId="Heading6">
+  <w:style w:type="paragraph" w:styleId="Ttulo6">
     <w:name w:val="heading 6"/>
     <w:basedOn w:val="Normal"/>
     <w:next w:val="Normal"/>
-    <w:link w:val="Heading6Char"/>
+    <w:link w:val="Ttulo6Car"/>
     <w:uiPriority w:val="9"/>
     <w:semiHidden/>
     <w:unhideWhenUsed/>
@@ -4274,11 +4067,11 @@
       <w:color w:val="595959" w:themeColor="text1" w:themeTint="A6"/>
     </w:rPr>
   </w:style>
-  <w:style w:type="paragraph" w:styleId="Heading7">
+  <w:style w:type="paragraph" w:styleId="Ttulo7">
     <w:name w:val="heading 7"/>
     <w:basedOn w:val="Normal"/>
     <w:next w:val="Normal"/>
-    <w:link w:val="Heading7Char"/>
+    <w:link w:val="Ttulo7Car"/>
     <w:uiPriority w:val="9"/>
     <w:semiHidden/>
     <w:unhideWhenUsed/>
@@ -4295,11 +4088,11 @@
       <w:color w:val="595959" w:themeColor="text1" w:themeTint="A6"/>
     </w:rPr>
   </w:style>
-  <w:style w:type="paragraph" w:styleId="Heading8">
+  <w:style w:type="paragraph" w:styleId="Ttulo8">
     <w:name w:val="heading 8"/>
     <w:basedOn w:val="Normal"/>
     <w:next w:val="Normal"/>
-    <w:link w:val="Heading8Char"/>
+    <w:link w:val="Ttulo8Car"/>
     <w:uiPriority w:val="9"/>
     <w:semiHidden/>
     <w:unhideWhenUsed/>
@@ -4317,11 +4110,11 @@
       <w:color w:val="272727" w:themeColor="text1" w:themeTint="D8"/>
     </w:rPr>
   </w:style>
-  <w:style w:type="paragraph" w:styleId="Heading9">
+  <w:style w:type="paragraph" w:styleId="Ttulo9">
     <w:name w:val="heading 9"/>
     <w:basedOn w:val="Normal"/>
     <w:next w:val="Normal"/>
-    <w:link w:val="Heading9Char"/>
+    <w:link w:val="Ttulo9Car"/>
     <w:uiPriority w:val="9"/>
     <w:semiHidden/>
     <w:unhideWhenUsed/>
@@ -4337,13 +4130,13 @@
       <w:color w:val="272727" w:themeColor="text1" w:themeTint="D8"/>
     </w:rPr>
   </w:style>
-  <w:style w:type="character" w:default="1" w:styleId="DefaultParagraphFont">
+  <w:style w:type="character" w:default="1" w:styleId="Fuentedeprrafopredeter">
     <w:name w:val="Default Paragraph Font"/>
     <w:uiPriority w:val="1"/>
     <w:semiHidden/>
     <w:unhideWhenUsed/>
   </w:style>
-  <w:style w:type="table" w:default="1" w:styleId="TableNormal">
+  <w:style w:type="table" w:default="1" w:styleId="Tablanormal">
     <w:name w:val="Normal Table"/>
     <w:uiPriority w:val="99"/>
     <w:semiHidden/>
@@ -4358,16 +4151,16 @@
       </w:tblCellMar>
     </w:tblPr>
   </w:style>
-  <w:style w:type="numbering" w:default="1" w:styleId="NoList">
+  <w:style w:type="numbering" w:default="1" w:styleId="Sinlista">
     <w:name w:val="No List"/>
     <w:uiPriority w:val="99"/>
     <w:semiHidden/>
     <w:unhideWhenUsed/>
   </w:style>
-  <w:style w:type="character" w:customStyle="1" w:styleId="Heading1Char">
-    <w:name w:val="Heading 1 Char"/>
-    <w:basedOn w:val="DefaultParagraphFont"/>
-    <w:link w:val="Heading1"/>
+  <w:style w:type="character" w:customStyle="1" w:styleId="Ttulo1Car">
+    <w:name w:val="Título 1 Car"/>
+    <w:basedOn w:val="Fuentedeprrafopredeter"/>
+    <w:link w:val="Ttulo1"/>
     <w:uiPriority w:val="9"/>
     <w:rsid w:val="00111D5C"/>
     <w:rPr>
@@ -4378,10 +4171,10 @@
       <w:lang w:val="es-CL"/>
     </w:rPr>
   </w:style>
-  <w:style w:type="character" w:customStyle="1" w:styleId="Heading2Char">
-    <w:name w:val="Heading 2 Char"/>
-    <w:basedOn w:val="DefaultParagraphFont"/>
-    <w:link w:val="Heading2"/>
+  <w:style w:type="character" w:customStyle="1" w:styleId="Ttulo2Car">
+    <w:name w:val="Título 2 Car"/>
+    <w:basedOn w:val="Fuentedeprrafopredeter"/>
+    <w:link w:val="Ttulo2"/>
     <w:uiPriority w:val="9"/>
     <w:semiHidden/>
     <w:rsid w:val="00111D5C"/>
@@ -4393,10 +4186,10 @@
       <w:lang w:val="es-CL"/>
     </w:rPr>
   </w:style>
-  <w:style w:type="character" w:customStyle="1" w:styleId="Heading3Char">
-    <w:name w:val="Heading 3 Char"/>
-    <w:basedOn w:val="DefaultParagraphFont"/>
-    <w:link w:val="Heading3"/>
+  <w:style w:type="character" w:customStyle="1" w:styleId="Ttulo3Car">
+    <w:name w:val="Título 3 Car"/>
+    <w:basedOn w:val="Fuentedeprrafopredeter"/>
+    <w:link w:val="Ttulo3"/>
     <w:uiPriority w:val="9"/>
     <w:semiHidden/>
     <w:rsid w:val="00111D5C"/>
@@ -4408,10 +4201,10 @@
       <w:lang w:val="es-CL"/>
     </w:rPr>
   </w:style>
-  <w:style w:type="character" w:customStyle="1" w:styleId="Heading4Char">
-    <w:name w:val="Heading 4 Char"/>
-    <w:basedOn w:val="DefaultParagraphFont"/>
-    <w:link w:val="Heading4"/>
+  <w:style w:type="character" w:customStyle="1" w:styleId="Ttulo4Car">
+    <w:name w:val="Título 4 Car"/>
+    <w:basedOn w:val="Fuentedeprrafopredeter"/>
+    <w:link w:val="Ttulo4"/>
     <w:uiPriority w:val="9"/>
     <w:semiHidden/>
     <w:rsid w:val="00111D5C"/>
@@ -4423,10 +4216,10 @@
       <w:lang w:val="es-CL"/>
     </w:rPr>
   </w:style>
-  <w:style w:type="character" w:customStyle="1" w:styleId="Heading5Char">
-    <w:name w:val="Heading 5 Char"/>
-    <w:basedOn w:val="DefaultParagraphFont"/>
-    <w:link w:val="Heading5"/>
+  <w:style w:type="character" w:customStyle="1" w:styleId="Ttulo5Car">
+    <w:name w:val="Título 5 Car"/>
+    <w:basedOn w:val="Fuentedeprrafopredeter"/>
+    <w:link w:val="Ttulo5"/>
     <w:uiPriority w:val="9"/>
     <w:semiHidden/>
     <w:rsid w:val="00111D5C"/>
@@ -4436,10 +4229,10 @@
       <w:lang w:val="es-CL"/>
     </w:rPr>
   </w:style>
-  <w:style w:type="character" w:customStyle="1" w:styleId="Heading6Char">
-    <w:name w:val="Heading 6 Char"/>
-    <w:basedOn w:val="DefaultParagraphFont"/>
-    <w:link w:val="Heading6"/>
+  <w:style w:type="character" w:customStyle="1" w:styleId="Ttulo6Car">
+    <w:name w:val="Título 6 Car"/>
+    <w:basedOn w:val="Fuentedeprrafopredeter"/>
+    <w:link w:val="Ttulo6"/>
     <w:uiPriority w:val="9"/>
     <w:semiHidden/>
     <w:rsid w:val="00111D5C"/>
@@ -4451,10 +4244,10 @@
       <w:lang w:val="es-CL"/>
     </w:rPr>
   </w:style>
-  <w:style w:type="character" w:customStyle="1" w:styleId="Heading7Char">
-    <w:name w:val="Heading 7 Char"/>
-    <w:basedOn w:val="DefaultParagraphFont"/>
-    <w:link w:val="Heading7"/>
+  <w:style w:type="character" w:customStyle="1" w:styleId="Ttulo7Car">
+    <w:name w:val="Título 7 Car"/>
+    <w:basedOn w:val="Fuentedeprrafopredeter"/>
+    <w:link w:val="Ttulo7"/>
     <w:uiPriority w:val="9"/>
     <w:semiHidden/>
     <w:rsid w:val="00111D5C"/>
@@ -4464,10 +4257,10 @@
       <w:lang w:val="es-CL"/>
     </w:rPr>
   </w:style>
-  <w:style w:type="character" w:customStyle="1" w:styleId="Heading8Char">
-    <w:name w:val="Heading 8 Char"/>
-    <w:basedOn w:val="DefaultParagraphFont"/>
-    <w:link w:val="Heading8"/>
+  <w:style w:type="character" w:customStyle="1" w:styleId="Ttulo8Car">
+    <w:name w:val="Título 8 Car"/>
+    <w:basedOn w:val="Fuentedeprrafopredeter"/>
+    <w:link w:val="Ttulo8"/>
     <w:uiPriority w:val="9"/>
     <w:semiHidden/>
     <w:rsid w:val="00111D5C"/>
@@ -4479,10 +4272,10 @@
       <w:lang w:val="es-CL"/>
     </w:rPr>
   </w:style>
-  <w:style w:type="character" w:customStyle="1" w:styleId="Heading9Char">
-    <w:name w:val="Heading 9 Char"/>
-    <w:basedOn w:val="DefaultParagraphFont"/>
-    <w:link w:val="Heading9"/>
+  <w:style w:type="character" w:customStyle="1" w:styleId="Ttulo9Car">
+    <w:name w:val="Título 9 Car"/>
+    <w:basedOn w:val="Fuentedeprrafopredeter"/>
+    <w:link w:val="Ttulo9"/>
     <w:uiPriority w:val="9"/>
     <w:semiHidden/>
     <w:rsid w:val="00111D5C"/>
@@ -4492,11 +4285,11 @@
       <w:lang w:val="es-CL"/>
     </w:rPr>
   </w:style>
-  <w:style w:type="paragraph" w:styleId="Title">
+  <w:style w:type="paragraph" w:styleId="Ttulo">
     <w:name w:val="Title"/>
     <w:basedOn w:val="Normal"/>
     <w:next w:val="Normal"/>
-    <w:link w:val="TitleChar"/>
+    <w:link w:val="TtuloCar"/>
     <w:uiPriority w:val="10"/>
     <w:qFormat/>
     <w:rsid w:val="00111D5C"/>
@@ -4512,10 +4305,10 @@
       <w:szCs w:val="56"/>
     </w:rPr>
   </w:style>
-  <w:style w:type="character" w:customStyle="1" w:styleId="TitleChar">
-    <w:name w:val="Title Char"/>
-    <w:basedOn w:val="DefaultParagraphFont"/>
-    <w:link w:val="Title"/>
+  <w:style w:type="character" w:customStyle="1" w:styleId="TtuloCar">
+    <w:name w:val="Título Car"/>
+    <w:basedOn w:val="Fuentedeprrafopredeter"/>
+    <w:link w:val="Ttulo"/>
     <w:uiPriority w:val="10"/>
     <w:rsid w:val="00111D5C"/>
     <w:rPr>
@@ -4527,11 +4320,11 @@
       <w:lang w:val="es-CL"/>
     </w:rPr>
   </w:style>
-  <w:style w:type="paragraph" w:styleId="Subtitle">
+  <w:style w:type="paragraph" w:styleId="Subttulo">
     <w:name w:val="Subtitle"/>
     <w:basedOn w:val="Normal"/>
     <w:next w:val="Normal"/>
-    <w:link w:val="SubtitleChar"/>
+    <w:link w:val="SubttuloCar"/>
     <w:uiPriority w:val="11"/>
     <w:qFormat/>
     <w:rsid w:val="00111D5C"/>
@@ -4549,10 +4342,10 @@
       <w:szCs w:val="28"/>
     </w:rPr>
   </w:style>
-  <w:style w:type="character" w:customStyle="1" w:styleId="SubtitleChar">
-    <w:name w:val="Subtitle Char"/>
-    <w:basedOn w:val="DefaultParagraphFont"/>
-    <w:link w:val="Subtitle"/>
+  <w:style w:type="character" w:customStyle="1" w:styleId="SubttuloCar">
+    <w:name w:val="Subtítulo Car"/>
+    <w:basedOn w:val="Fuentedeprrafopredeter"/>
+    <w:link w:val="Subttulo"/>
     <w:uiPriority w:val="11"/>
     <w:rsid w:val="00111D5C"/>
     <w:rPr>
@@ -4564,11 +4357,11 @@
       <w:lang w:val="es-CL"/>
     </w:rPr>
   </w:style>
-  <w:style w:type="paragraph" w:styleId="Quote">
+  <w:style w:type="paragraph" w:styleId="Cita">
     <w:name w:val="Quote"/>
     <w:basedOn w:val="Normal"/>
     <w:next w:val="Normal"/>
-    <w:link w:val="QuoteChar"/>
+    <w:link w:val="CitaCar"/>
     <w:uiPriority w:val="29"/>
     <w:qFormat/>
     <w:rsid w:val="00111D5C"/>
@@ -4582,10 +4375,10 @@
       <w:color w:val="404040" w:themeColor="text1" w:themeTint="BF"/>
     </w:rPr>
   </w:style>
-  <w:style w:type="character" w:customStyle="1" w:styleId="QuoteChar">
-    <w:name w:val="Quote Char"/>
-    <w:basedOn w:val="DefaultParagraphFont"/>
-    <w:link w:val="Quote"/>
+  <w:style w:type="character" w:customStyle="1" w:styleId="CitaCar">
+    <w:name w:val="Cita Car"/>
+    <w:basedOn w:val="Fuentedeprrafopredeter"/>
+    <w:link w:val="Cita"/>
     <w:uiPriority w:val="29"/>
     <w:rsid w:val="00111D5C"/>
     <w:rPr>
@@ -4595,7 +4388,7 @@
       <w:lang w:val="es-CL"/>
     </w:rPr>
   </w:style>
-  <w:style w:type="paragraph" w:styleId="ListParagraph">
+  <w:style w:type="paragraph" w:styleId="Prrafodelista">
     <w:name w:val="List Paragraph"/>
     <w:basedOn w:val="Normal"/>
     <w:uiPriority w:val="34"/>
@@ -4606,9 +4399,9 @@
       <w:contextualSpacing/>
     </w:pPr>
   </w:style>
-  <w:style w:type="character" w:styleId="IntenseEmphasis">
+  <w:style w:type="character" w:styleId="nfasisintenso">
     <w:name w:val="Intense Emphasis"/>
-    <w:basedOn w:val="DefaultParagraphFont"/>
+    <w:basedOn w:val="Fuentedeprrafopredeter"/>
     <w:uiPriority w:val="21"/>
     <w:qFormat/>
     <w:rsid w:val="00111D5C"/>
@@ -4618,11 +4411,11 @@
       <w:color w:val="0F4761" w:themeColor="accent1" w:themeShade="BF"/>
     </w:rPr>
   </w:style>
-  <w:style w:type="paragraph" w:styleId="IntenseQuote">
+  <w:style w:type="paragraph" w:styleId="Citadestacada">
     <w:name w:val="Intense Quote"/>
     <w:basedOn w:val="Normal"/>
     <w:next w:val="Normal"/>
-    <w:link w:val="IntenseQuoteChar"/>
+    <w:link w:val="CitadestacadaCar"/>
     <w:uiPriority w:val="30"/>
     <w:qFormat/>
     <w:rsid w:val="00111D5C"/>
@@ -4641,10 +4434,10 @@
       <w:color w:val="0F4761" w:themeColor="accent1" w:themeShade="BF"/>
     </w:rPr>
   </w:style>
-  <w:style w:type="character" w:customStyle="1" w:styleId="IntenseQuoteChar">
-    <w:name w:val="Intense Quote Char"/>
-    <w:basedOn w:val="DefaultParagraphFont"/>
-    <w:link w:val="IntenseQuote"/>
+  <w:style w:type="character" w:customStyle="1" w:styleId="CitadestacadaCar">
+    <w:name w:val="Cita destacada Car"/>
+    <w:basedOn w:val="Fuentedeprrafopredeter"/>
+    <w:link w:val="Citadestacada"/>
     <w:uiPriority w:val="30"/>
     <w:rsid w:val="00111D5C"/>
     <w:rPr>
@@ -4654,9 +4447,9 @@
       <w:lang w:val="es-CL"/>
     </w:rPr>
   </w:style>
-  <w:style w:type="character" w:styleId="IntenseReference">
+  <w:style w:type="character" w:styleId="Referenciaintensa">
     <w:name w:val="Intense Reference"/>
-    <w:basedOn w:val="DefaultParagraphFont"/>
+    <w:basedOn w:val="Fuentedeprrafopredeter"/>
     <w:uiPriority w:val="32"/>
     <w:qFormat/>
     <w:rsid w:val="00111D5C"/>
@@ -4668,10 +4461,10 @@
       <w:spacing w:val="5"/>
     </w:rPr>
   </w:style>
-  <w:style w:type="paragraph" w:styleId="BodyText">
+  <w:style w:type="paragraph" w:styleId="Textoindependiente">
     <w:name w:val="Body Text"/>
     <w:basedOn w:val="Normal"/>
-    <w:link w:val="BodyTextChar"/>
+    <w:link w:val="TextoindependienteCar"/>
     <w:uiPriority w:val="99"/>
     <w:semiHidden/>
     <w:unhideWhenUsed/>
@@ -4680,10 +4473,10 @@
       <w:spacing w:after="120"/>
     </w:pPr>
   </w:style>
-  <w:style w:type="character" w:customStyle="1" w:styleId="BodyTextChar">
-    <w:name w:val="Body Text Char"/>
-    <w:basedOn w:val="DefaultParagraphFont"/>
-    <w:link w:val="BodyText"/>
+  <w:style w:type="character" w:customStyle="1" w:styleId="TextoindependienteCar">
+    <w:name w:val="Texto independiente Car"/>
+    <w:basedOn w:val="Fuentedeprrafopredeter"/>
+    <w:link w:val="Textoindependiente"/>
     <w:uiPriority w:val="99"/>
     <w:semiHidden/>
     <w:rsid w:val="00111D5C"/>
@@ -4691,10 +4484,10 @@
       <w:lang w:val="es-CL"/>
     </w:rPr>
   </w:style>
-  <w:style w:type="paragraph" w:styleId="Header">
+  <w:style w:type="paragraph" w:styleId="Encabezado">
     <w:name w:val="header"/>
     <w:basedOn w:val="Normal"/>
-    <w:link w:val="HeaderChar"/>
+    <w:link w:val="EncabezadoCar"/>
     <w:uiPriority w:val="99"/>
     <w:unhideWhenUsed/>
     <w:rsid w:val="00F76E0B"/>
@@ -4705,20 +4498,20 @@
       </w:tabs>
     </w:pPr>
   </w:style>
-  <w:style w:type="character" w:customStyle="1" w:styleId="HeaderChar">
-    <w:name w:val="Header Char"/>
-    <w:basedOn w:val="DefaultParagraphFont"/>
-    <w:link w:val="Header"/>
+  <w:style w:type="character" w:customStyle="1" w:styleId="EncabezadoCar">
+    <w:name w:val="Encabezado Car"/>
+    <w:basedOn w:val="Fuentedeprrafopredeter"/>
+    <w:link w:val="Encabezado"/>
     <w:uiPriority w:val="99"/>
     <w:rsid w:val="00F76E0B"/>
     <w:rPr>
       <w:lang w:val="es-CL"/>
     </w:rPr>
   </w:style>
-  <w:style w:type="paragraph" w:styleId="Footer">
+  <w:style w:type="paragraph" w:styleId="Piedepgina">
     <w:name w:val="footer"/>
     <w:basedOn w:val="Normal"/>
-    <w:link w:val="FooterChar"/>
+    <w:link w:val="PiedepginaCar"/>
     <w:uiPriority w:val="99"/>
     <w:unhideWhenUsed/>
     <w:rsid w:val="00F76E0B"/>
@@ -4729,10 +4522,10 @@
       </w:tabs>
     </w:pPr>
   </w:style>
-  <w:style w:type="character" w:customStyle="1" w:styleId="FooterChar">
-    <w:name w:val="Footer Char"/>
-    <w:basedOn w:val="DefaultParagraphFont"/>
-    <w:link w:val="Footer"/>
+  <w:style w:type="character" w:customStyle="1" w:styleId="PiedepginaCar">
+    <w:name w:val="Pie de página Car"/>
+    <w:basedOn w:val="Fuentedeprrafopredeter"/>
+    <w:link w:val="Piedepgina"/>
     <w:uiPriority w:val="99"/>
     <w:rsid w:val="00F76E0B"/>
     <w:rPr>

</xml_diff>